<commit_message>
Update tutorial on soft shadows in DaVinci Resolve with new images and revised instructions
</commit_message>
<xml_diff>
--- a/Articles/2026/3_DaVinci_Tips_and_Tricks/12_Using_Duplicate_Clips_to_Make_a_Soft_Shadow_in_DaVinci_Resolve/12 Using Duplicate Clips to Make a Soft Shadow in DaVinci Resolve.docx
+++ b/Articles/2026/3_DaVinci_Tips_and_Tricks/12_Using_Duplicate_Clips_to_Make_a_Soft_Shadow_in_DaVinci_Resolve/12 Using Duplicate Clips to Make a Soft Shadow in DaVinci Resolve.docx
@@ -21,6 +21,9 @@
         <w:pStyle w:val="NoSpacing"/>
       </w:pPr>
       <w:r>
+        <w:rPr>
+          <w:noProof/>
+        </w:rPr>
         <w:drawing>
           <wp:inline distT="0" distB="0" distL="0" distR="0" wp14:anchorId="4C92AB23" wp14:editId="31BC4B7C">
             <wp:extent cx="5477639" cy="3343742"/>
@@ -159,7 +162,10 @@
     <w:p>
       <w:r>
         <w:lastRenderedPageBreak/>
-        <w:t xml:space="preserve">Duplicate the track you want to add a shadow to, then pull it under the main track. </w:t>
+        <w:t>In DaVinci Resolve, d</w:t>
+      </w:r>
+      <w:r>
+        <w:t xml:space="preserve">uplicate the track you want to add a shadow to, then pull it under the main track. </w:t>
       </w:r>
     </w:p>
     <w:p>
@@ -466,35 +472,10 @@
     <w:p/>
     <w:p>
       <w:pPr>
-        <w:numPr>
-          <w:ilvl w:val="0"/>
-          <w:numId w:val="12"/>
-        </w:numPr>
-      </w:pPr>
-      <w:r>
-        <w:t>Apply:</w:t>
-      </w:r>
-      <w:r>
-        <w:br/>
-      </w:r>
-      <w:r>
-        <w:rPr>
-          <w:rFonts w:ascii="Segoe UI Emoji" w:hAnsi="Segoe UI Emoji" w:cs="Segoe UI Emoji"/>
-        </w:rPr>
-        <w:t>👉</w:t>
-      </w:r>
-      <w:r>
-        <w:t xml:space="preserve"> </w:t>
-      </w:r>
-      <w:r>
-        <w:rPr>
-          <w:b/>
-          <w:bCs/>
-        </w:rPr>
-        <w:t>Gaussian Blur</w:t>
-      </w:r>
-      <w:r>
-        <w:t xml:space="preserve"> (soften it) </w:t>
+        <w:pStyle w:val="Heading1"/>
+      </w:pPr>
+      <w:r>
+        <w:t>Effect – Gaussian Blur</w:t>
       </w:r>
     </w:p>
     <w:p>
@@ -2927,6 +2908,7 @@
   <w:style w:type="character" w:default="1" w:styleId="DefaultParagraphFont">
     <w:name w:val="Default Paragraph Font"/>
     <w:uiPriority w:val="1"/>
+    <w:semiHidden/>
     <w:unhideWhenUsed/>
   </w:style>
   <w:style w:type="table" w:default="1" w:styleId="TableNormal">

</xml_diff>